<commit_message>
remove lober.dk from documentation and files
</commit_message>
<xml_diff>
--- a/docs/shared/Vandrekalender_ScrapingSources_v2.docx
+++ b/docs/shared/Vandrekalender_ScrapingSources_v2.docx
@@ -2175,156 +2175,6 @@
                 <w:sz w:val="20"/>
                 <w:szCs w:val="20"/>
               </w:rPr>
-              <w:t>Løber.dk</w:t>
-            </w:r>
-          </w:p>
-        </w:tc>
-        <w:tc>
-          <w:tcPr>
-            <w:tcW w:w="2000" w:type="dxa"/>
-            <w:tcBorders>
-              <w:top w:val="single" w:sz="1" w:space="0" w:color="DDDDDD"/>
-              <w:left w:val="single" w:sz="1" w:space="0" w:color="DDDDDD"/>
-              <w:bottom w:val="single" w:sz="1" w:space="0" w:color="DDDDDD"/>
-              <w:right w:val="single" w:sz="1" w:space="0" w:color="DDDDDD"/>
-            </w:tcBorders>
-            <w:tcMar>
-              <w:top w:w="80" w:type="dxa"/>
-              <w:left w:w="100" w:type="dxa"/>
-              <w:bottom w:w="80" w:type="dxa"/>
-              <w:right w:w="100" w:type="dxa"/>
-            </w:tcMar>
-          </w:tcPr>
-          <w:p>
-            <w:r>
-              <w:rPr>
-                <w:rFonts w:ascii="Courier New" w:eastAsia="Courier New" w:hAnsi="Courier New" w:cs="Courier New"/>
-                <w:color w:val="1A4A8A"/>
-                <w:sz w:val="19"/>
-                <w:szCs w:val="19"/>
-              </w:rPr>
-              <w:t>lober.dk</w:t>
-            </w:r>
-          </w:p>
-        </w:tc>
-        <w:tc>
-          <w:tcPr>
-            <w:tcW w:w="1400" w:type="dxa"/>
-            <w:tcBorders>
-              <w:top w:val="single" w:sz="1" w:space="0" w:color="DDDDDD"/>
-              <w:left w:val="single" w:sz="1" w:space="0" w:color="DDDDDD"/>
-              <w:bottom w:val="single" w:sz="1" w:space="0" w:color="DDDDDD"/>
-              <w:right w:val="single" w:sz="1" w:space="0" w:color="DDDDDD"/>
-            </w:tcBorders>
-            <w:tcMar>
-              <w:top w:w="80" w:type="dxa"/>
-              <w:left w:w="100" w:type="dxa"/>
-              <w:bottom w:w="80" w:type="dxa"/>
-              <w:right w:w="100" w:type="dxa"/>
-            </w:tcMar>
-          </w:tcPr>
-          <w:p>
-            <w:r>
-              <w:rPr>
-                <w:color w:val="555555"/>
-                <w:sz w:val="20"/>
-                <w:szCs w:val="20"/>
-              </w:rPr>
-              <w:t>HTML / API check</w:t>
-            </w:r>
-          </w:p>
-        </w:tc>
-        <w:tc>
-          <w:tcPr>
-            <w:tcW w:w="900" w:type="dxa"/>
-            <w:tcBorders>
-              <w:top w:val="single" w:sz="1" w:space="0" w:color="DDDDDD"/>
-              <w:left w:val="single" w:sz="1" w:space="0" w:color="DDDDDD"/>
-              <w:bottom w:val="single" w:sz="1" w:space="0" w:color="DDDDDD"/>
-              <w:right w:val="single" w:sz="1" w:space="0" w:color="DDDDDD"/>
-            </w:tcBorders>
-            <w:shd w:val="clear" w:color="auto" w:fill="FFF3E0"/>
-            <w:tcMar>
-              <w:top w:w="80" w:type="dxa"/>
-              <w:left w:w="100" w:type="dxa"/>
-              <w:bottom w:w="80" w:type="dxa"/>
-              <w:right w:w="100" w:type="dxa"/>
-            </w:tcMar>
-          </w:tcPr>
-          <w:p>
-            <w:pPr>
-              <w:jc w:val="center"/>
-            </w:pPr>
-            <w:r>
-              <w:rPr>
-                <w:b/>
-                <w:bCs/>
-                <w:color w:val="E65100"/>
-                <w:sz w:val="20"/>
-                <w:szCs w:val="20"/>
-              </w:rPr>
-              <w:t>Medium</w:t>
-            </w:r>
-          </w:p>
-        </w:tc>
-        <w:tc>
-          <w:tcPr>
-            <w:tcW w:w="3500" w:type="dxa"/>
-            <w:tcBorders>
-              <w:top w:val="single" w:sz="1" w:space="0" w:color="DDDDDD"/>
-              <w:left w:val="single" w:sz="1" w:space="0" w:color="DDDDDD"/>
-              <w:bottom w:val="single" w:sz="1" w:space="0" w:color="DDDDDD"/>
-              <w:right w:val="single" w:sz="1" w:space="0" w:color="DDDDDD"/>
-            </w:tcBorders>
-            <w:tcMar>
-              <w:top w:w="80" w:type="dxa"/>
-              <w:left w:w="100" w:type="dxa"/>
-              <w:bottom w:w="80" w:type="dxa"/>
-              <w:right w:w="100" w:type="dxa"/>
-            </w:tcMar>
-          </w:tcPr>
-          <w:p>
-            <w:r>
-              <w:rPr>
-                <w:sz w:val="20"/>
-                <w:szCs w:val="20"/>
-              </w:rPr>
-              <w:t>Danish running event directory. Filter for walking categories</w:t>
-            </w:r>
-          </w:p>
-        </w:tc>
-      </w:tr>
-      <w:tr>
-        <w:tblPrEx>
-          <w:tblCellMar>
-            <w:top w:w="0" w:type="dxa"/>
-            <w:bottom w:w="0" w:type="dxa"/>
-          </w:tblCellMar>
-        </w:tblPrEx>
-        <w:tc>
-          <w:tcPr>
-            <w:tcW w:w="1800" w:type="dxa"/>
-            <w:tcBorders>
-              <w:top w:val="single" w:sz="1" w:space="0" w:color="DDDDDD"/>
-              <w:left w:val="single" w:sz="1" w:space="0" w:color="DDDDDD"/>
-              <w:bottom w:val="single" w:sz="1" w:space="0" w:color="DDDDDD"/>
-              <w:right w:val="single" w:sz="1" w:space="0" w:color="DDDDDD"/>
-            </w:tcBorders>
-            <w:tcMar>
-              <w:top w:w="80" w:type="dxa"/>
-              <w:left w:w="100" w:type="dxa"/>
-              <w:bottom w:w="80" w:type="dxa"/>
-              <w:right w:w="100" w:type="dxa"/>
-            </w:tcMar>
-          </w:tcPr>
-          <w:p>
-            <w:r>
-              <w:rPr>
-                <w:b/>
-                <w:bCs/>
-                <w:sz w:val="20"/>
-                <w:szCs w:val="20"/>
-              </w:rPr>
               <w:t>Motionsplan.dk</w:t>
             </w:r>
           </w:p>
@@ -7007,7 +6857,7 @@
         <w:spacing w:after="80"/>
       </w:pPr>
       <w:r>
-        <w:t>Confirm whether Løber.dk, Finishers.com, and Sportstiming.dk have public APIs</w:t>
+        <w:t>Confirm whether Finishers.com and Sportstiming.dk have public APIs</w:t>
       </w:r>
     </w:p>
     <w:p>

</xml_diff>